<commit_message>
docs: remove redundant itinerary declaration
</commit_message>
<xml_diff>
--- a/20260925/visa-itinerary-2026-en.docx
+++ b/20260925/visa-itinerary-2026-en.docx
@@ -3332,46 +3332,6 @@
         </w:tc>
       </w:tr>
     </w:tbl>
-    <w:p>
-      <w:pPr>
-        <w:spacing w:after="60"/>
-      </w:pPr>
-      <w:r>
-        <w:rPr>
-          <w:b/>
-          <w:sz w:val="20"/>
-          <w:szCs w:val="20"/>
-          <w:rFonts w:ascii="Arial" w:hAnsi="Arial" w:eastAsia="Microsoft YaHei"/>
-        </w:rPr>
-        <w:t xml:space="preserve">Declaration</w:t>
-      </w:r>
-    </w:p>
-    <w:p>
-      <w:pPr>
-        <w:spacing w:after="60"/>
-      </w:pPr>
-      <w:r>
-        <w:rPr>
-          <w:sz w:val="17"/>
-          <w:szCs w:val="17"/>
-          <w:rFonts w:ascii="Arial" w:hAnsi="Arial" w:eastAsia="Microsoft YaHei"/>
-        </w:rPr>
-        <w:t xml:space="preserve">I declare that all information above is true and accurate. This trip is for leisure only, with no immigration intent. I will return to China on 8 October 2026.</w:t>
-      </w:r>
-    </w:p>
-    <w:p>
-      <w:pPr>
-        <w:spacing w:after="60"/>
-      </w:pPr>
-      <w:r>
-        <w:rPr>
-          <w:sz w:val="18"/>
-          <w:szCs w:val="18"/>
-          <w:rFonts w:ascii="Arial" w:hAnsi="Arial" w:eastAsia="Microsoft YaHei"/>
-        </w:rPr>
-        <w:t xml:space="preserve">Signature: ________________    Date: ________________</w:t>
-      </w:r>
-    </w:p>
     <w:sectPr>
       <w:pgSz w:w="11906" w:h="16838"/>
       <w:pgMar w:top="720" w:right="540" w:bottom="720" w:left="540"/>

</xml_diff>